<commit_message>
git push origin master
</commit_message>
<xml_diff>
--- a/工作室项目日志.docx
+++ b/工作室项目日志.docx
@@ -37,16 +37,7 @@
           <w:rFonts w:hint="eastAsia"/>
           <w:lang w:val="en-US" w:eastAsia="zh-CN"/>
         </w:rPr>
-        <w:t>10.15:git项目搭建，api测试，前端测试，后</w:t>
-      </w:r>
-      <w:bookmarkStart w:id="0" w:name="_GoBack"/>
-      <w:bookmarkEnd w:id="0"/>
-      <w:r>
-        <w:rPr>
-          <w:rFonts w:hint="eastAsia"/>
-          <w:lang w:val="en-US" w:eastAsia="zh-CN"/>
-        </w:rPr>
-        <w:t>端测试</w:t>
+        <w:t>10.15:git项目搭建，api测试，前端测试</w:t>
       </w:r>
     </w:p>
     <w:p>
@@ -56,6 +47,15 @@
           <w:lang w:val="en-US" w:eastAsia="zh-CN"/>
         </w:rPr>
       </w:pPr>
+      <w:r>
+        <w:rPr>
+          <w:rFonts w:hint="eastAsia"/>
+          <w:lang w:val="en-US" w:eastAsia="zh-CN"/>
+        </w:rPr>
+        <w:t>10.16:后端测试，security+jwt传输文档</w:t>
+      </w:r>
+      <w:bookmarkStart w:id="0" w:name="_GoBack"/>
+      <w:bookmarkEnd w:id="0"/>
     </w:p>
     <w:sectPr>
       <w:pgSz w:w="11906" w:h="16838"/>
@@ -143,7 +143,7 @@
     <w:lsdException w:qFormat="1" w:unhideWhenUsed="0" w:uiPriority="0" w:semiHidden="0" w:name="Title"/>
     <w:lsdException w:unhideWhenUsed="0" w:uiPriority="0" w:semiHidden="0" w:name="Closing"/>
     <w:lsdException w:unhideWhenUsed="0" w:uiPriority="0" w:semiHidden="0" w:name="Signature"/>
-    <w:lsdException w:unhideWhenUsed="0" w:uiPriority="0" w:name="Default Paragraph Font"/>
+    <w:lsdException w:qFormat="1" w:unhideWhenUsed="0" w:uiPriority="0" w:name="Default Paragraph Font"/>
     <w:lsdException w:unhideWhenUsed="0" w:uiPriority="0" w:semiHidden="0" w:name="Body Text"/>
     <w:lsdException w:unhideWhenUsed="0" w:uiPriority="0" w:semiHidden="0" w:name="Body Text Indent"/>
     <w:lsdException w:unhideWhenUsed="0" w:uiPriority="0" w:semiHidden="0" w:name="List Continue"/>
@@ -181,7 +181,7 @@
     <w:lsdException w:unhideWhenUsed="0" w:uiPriority="0" w:semiHidden="0" w:name="HTML Sample"/>
     <w:lsdException w:unhideWhenUsed="0" w:uiPriority="0" w:semiHidden="0" w:name="HTML Typewriter"/>
     <w:lsdException w:unhideWhenUsed="0" w:uiPriority="0" w:semiHidden="0" w:name="HTML Variable"/>
-    <w:lsdException w:unhideWhenUsed="0" w:uiPriority="0" w:name="Normal Table"/>
+    <w:lsdException w:qFormat="1" w:unhideWhenUsed="0" w:uiPriority="0" w:name="Normal Table"/>
     <w:lsdException w:unhideWhenUsed="0" w:uiPriority="0" w:semiHidden="0" w:name="annotation subject"/>
     <w:lsdException w:unhideWhenUsed="0" w:uiPriority="0" w:semiHidden="0" w:name="Table Simple 1"/>
     <w:lsdException w:unhideWhenUsed="0" w:uiPriority="0" w:semiHidden="0" w:name="Table Simple 2"/>
@@ -346,11 +346,13 @@
   <w:style w:type="character" w:default="1" w:styleId="3">
     <w:name w:val="Default Paragraph Font"/>
     <w:semiHidden/>
+    <w:qFormat/>
     <w:uiPriority w:val="0"/>
   </w:style>
   <w:style w:type="table" w:default="1" w:styleId="2">
     <w:name w:val="Normal Table"/>
     <w:semiHidden/>
+    <w:qFormat/>
     <w:uiPriority w:val="0"/>
     <w:tblPr>
       <w:tblCellMar>

</xml_diff>